<commit_message>
Sexta Versão - Parte 04
</commit_message>
<xml_diff>
--- a/docs/conceitos_tia_portal.docx
+++ b/docs/conceitos_tia_portal.docx
@@ -1015,29 +1015,53 @@
           <w:sz w:val="32"/>
           <w:szCs w:val="32"/>
         </w:rPr>
-        <w:t>Endereçamentos de Entrada em Ladder (I0.0, I1.0, etc...)</w:t>
-      </w:r>
-    </w:p>
-    <w:p>
-      <w:pPr>
-        <w:spacing w:after="0"/>
-        <w:rPr>
-          <w:rFonts w:ascii="Arial" w:hAnsi="Arial" w:cs="Arial"/>
-        </w:rPr>
-      </w:pPr>
-    </w:p>
-    <w:p>
-      <w:pPr>
-        <w:spacing w:after="0"/>
-        <w:rPr>
-          <w:rFonts w:ascii="Arial" w:hAnsi="Arial" w:cs="Arial"/>
-        </w:rPr>
-      </w:pPr>
-      <w:r>
-        <w:rPr>
-          <w:rFonts w:ascii="Arial" w:hAnsi="Arial" w:cs="Arial"/>
-        </w:rPr>
-        <w:t>Representam as entradas físicas (Inputs) do CLP mapeadas dentro do programa Ladder. São os endereços que recebem os sinais elétricos diretos de botões e sensores externos quando acionados em campo.</w:t>
+        <w:t>CTUD (Count Up/Down - Contador Crescente/Decrescente) em Ladder</w:t>
+      </w:r>
+    </w:p>
+    <w:p>
+      <w:pPr>
+        <w:spacing w:after="0"/>
+        <w:rPr>
+          <w:rFonts w:ascii="Arial" w:hAnsi="Arial" w:cs="Arial"/>
+        </w:rPr>
+      </w:pPr>
+    </w:p>
+    <w:p>
+      <w:pPr>
+        <w:spacing w:after="0"/>
+        <w:rPr>
+          <w:rFonts w:ascii="Arial" w:hAnsi="Arial" w:cs="Arial"/>
+        </w:rPr>
+      </w:pPr>
+      <w:r>
+        <w:rPr>
+          <w:rFonts w:ascii="Arial" w:hAnsi="Arial" w:cs="Arial"/>
+        </w:rPr>
+        <w:t>É uma instrução de contagem bidirecional utilizada para incrementar ou decrementar o seu valor acumulado interno de acordo com a entrada acionada. Ela possui duas entradas de contagem distintas: uma para somar uma unidade (borda de subida em CU) e outra para subtrair uma unidade (borda de subida em CD). Sua saída de limite superior (QU) é ligada quando o valor acumulado atinge ou supera o valor limite predefinido (PV), enquanto sua saída de limite inferior (QD) é ligada quando o valor acumulado é menor ou igual a zero, possuindo ainda entradas dedicadas para zerar o acumulador (Reset</w:t>
+      </w:r>
+      <w:r>
+        <w:rPr>
+          <w:rFonts w:ascii="Arial" w:hAnsi="Arial" w:cs="Arial"/>
+        </w:rPr>
+        <w:t xml:space="preserve"> - R</w:t>
+      </w:r>
+      <w:r>
+        <w:rPr>
+          <w:rFonts w:ascii="Arial" w:hAnsi="Arial" w:cs="Arial"/>
+        </w:rPr>
+        <w:t>) ou carregá-lo diretamente com o valor limite (Load</w:t>
+      </w:r>
+      <w:r>
+        <w:rPr>
+          <w:rFonts w:ascii="Arial" w:hAnsi="Arial" w:cs="Arial"/>
+        </w:rPr>
+        <w:t xml:space="preserve"> - LD</w:t>
+      </w:r>
+      <w:r>
+        <w:rPr>
+          <w:rFonts w:ascii="Arial" w:hAnsi="Arial" w:cs="Arial"/>
+        </w:rPr>
+        <w:t>).</w:t>
       </w:r>
     </w:p>
     <w:p>
@@ -1081,29 +1105,30 @@
           <w:sz w:val="32"/>
           <w:szCs w:val="32"/>
         </w:rPr>
-        <w:t>Endereçamentos de Saída em Ladder (Q0.0, Q1.0, etc...)</w:t>
-      </w:r>
-    </w:p>
-    <w:p>
-      <w:pPr>
-        <w:spacing w:after="0"/>
-        <w:rPr>
-          <w:rFonts w:ascii="Arial" w:hAnsi="Arial" w:cs="Arial"/>
-        </w:rPr>
-      </w:pPr>
-    </w:p>
-    <w:p>
-      <w:pPr>
-        <w:spacing w:after="0"/>
-        <w:rPr>
-          <w:rFonts w:ascii="Arial" w:hAnsi="Arial" w:cs="Arial"/>
-        </w:rPr>
-      </w:pPr>
-      <w:r>
-        <w:rPr>
-          <w:rFonts w:ascii="Arial" w:hAnsi="Arial" w:cs="Arial"/>
-        </w:rPr>
-        <w:t>Representam as saídas físicas (Outputs) do CLP no programa Ladder. São as instruções responsáveis por comandar os atuadores reais conectados ao CLP, tais como motores, lâmpadas e contatores.</w:t>
+        <w:t>Endereçamentos de Entrada em Ladder (I0.0, I1.0, etc...)</w:t>
+      </w:r>
+    </w:p>
+    <w:p>
+      <w:pPr>
+        <w:spacing w:after="0"/>
+        <w:rPr>
+          <w:rFonts w:ascii="Arial" w:hAnsi="Arial" w:cs="Arial"/>
+        </w:rPr>
+      </w:pPr>
+    </w:p>
+    <w:p>
+      <w:pPr>
+        <w:spacing w:after="0"/>
+        <w:rPr>
+          <w:rFonts w:ascii="Arial" w:hAnsi="Arial" w:cs="Arial"/>
+        </w:rPr>
+      </w:pPr>
+      <w:r>
+        <w:rPr>
+          <w:rFonts w:ascii="Arial" w:hAnsi="Arial" w:cs="Arial"/>
+        </w:rPr>
+        <w:lastRenderedPageBreak/>
+        <w:t>Representam as entradas físicas (Inputs) do CLP mapeadas dentro do programa Ladder. São os endereços que recebem os sinais elétricos diretos de botões e sensores externos quando acionados em campo.</w:t>
       </w:r>
     </w:p>
     <w:p>
@@ -1147,6 +1172,72 @@
           <w:sz w:val="32"/>
           <w:szCs w:val="32"/>
         </w:rPr>
+        <w:t>Endereçamentos de Saída em Ladder (Q0.0, Q1.0, etc...)</w:t>
+      </w:r>
+    </w:p>
+    <w:p>
+      <w:pPr>
+        <w:spacing w:after="0"/>
+        <w:rPr>
+          <w:rFonts w:ascii="Arial" w:hAnsi="Arial" w:cs="Arial"/>
+        </w:rPr>
+      </w:pPr>
+    </w:p>
+    <w:p>
+      <w:pPr>
+        <w:spacing w:after="0"/>
+        <w:rPr>
+          <w:rFonts w:ascii="Arial" w:hAnsi="Arial" w:cs="Arial"/>
+        </w:rPr>
+      </w:pPr>
+      <w:r>
+        <w:rPr>
+          <w:rFonts w:ascii="Arial" w:hAnsi="Arial" w:cs="Arial"/>
+        </w:rPr>
+        <w:t>Representam as saídas físicas (Outputs) do CLP no programa Ladder. São as instruções responsáveis por comandar os atuadores reais conectados ao CLP, tais como motores, lâmpadas e contatores.</w:t>
+      </w:r>
+    </w:p>
+    <w:p>
+      <w:pPr>
+        <w:pBdr>
+          <w:bottom w:val="single" w:sz="6" w:space="1" w:color="auto"/>
+        </w:pBdr>
+        <w:spacing w:after="0"/>
+        <w:rPr>
+          <w:rFonts w:ascii="Arial" w:hAnsi="Arial" w:cs="Arial"/>
+        </w:rPr>
+      </w:pPr>
+    </w:p>
+    <w:p>
+      <w:pPr>
+        <w:spacing w:after="0"/>
+        <w:rPr>
+          <w:rFonts w:ascii="Arial" w:hAnsi="Arial" w:cs="Arial"/>
+        </w:rPr>
+      </w:pPr>
+    </w:p>
+    <w:p>
+      <w:pPr>
+        <w:spacing w:after="0"/>
+        <w:jc w:val="center"/>
+        <w:rPr>
+          <w:rFonts w:ascii="Arial" w:hAnsi="Arial" w:cs="Arial"/>
+          <w:b/>
+          <w:bCs/>
+          <w:color w:val="2E74B5" w:themeColor="accent5" w:themeShade="BF"/>
+          <w:sz w:val="32"/>
+          <w:szCs w:val="32"/>
+        </w:rPr>
+      </w:pPr>
+      <w:r>
+        <w:rPr>
+          <w:rFonts w:ascii="Arial" w:hAnsi="Arial" w:cs="Arial"/>
+          <w:b/>
+          <w:bCs/>
+          <w:color w:val="2E74B5" w:themeColor="accent5" w:themeShade="BF"/>
+          <w:sz w:val="32"/>
+          <w:szCs w:val="32"/>
+        </w:rPr>
         <w:t>Endereçamentos de Memória em Ladder (M10.0, M11.0, etc...)</w:t>
       </w:r>
     </w:p>
@@ -1169,7 +1260,6 @@
         <w:rPr>
           <w:rFonts w:ascii="Arial" w:hAnsi="Arial" w:cs="Arial"/>
         </w:rPr>
-        <w:lastRenderedPageBreak/>
         <w:t>São bits de memória interna conhecidos como marcadores virtuais dentro da lógica Ladder. Funcionam como contatos ou bobinas internas para armazenar estados e ajudar no sequenciamento do código, sem necessitar de uma saída física direta.</w:t>
       </w:r>
     </w:p>
@@ -1441,47 +1531,7 @@
           <w:b/>
           <w:bCs/>
         </w:rPr>
-        <w:t xml:space="preserve"> </w:t>
-      </w:r>
-      <w:r>
-        <w:rPr>
-          <w:rFonts w:ascii="Arial" w:hAnsi="Arial" w:cs="Arial"/>
-          <w:b/>
-          <w:bCs/>
-        </w:rPr>
-        <w:t>—</w:t>
-      </w:r>
-      <w:r>
-        <w:rPr>
-          <w:rFonts w:ascii="Arial" w:hAnsi="Arial" w:cs="Arial"/>
-          <w:b/>
-          <w:bCs/>
-        </w:rPr>
-        <w:t xml:space="preserve"> B</w:t>
-      </w:r>
-      <w:r>
-        <w:rPr>
-          <w:rFonts w:ascii="Arial" w:hAnsi="Arial" w:cs="Arial"/>
-          <w:b/>
-          <w:bCs/>
-        </w:rPr>
-        <w:t>it 0 a</w:t>
-      </w:r>
-      <w:r>
-        <w:rPr>
-          <w:rFonts w:ascii="Arial" w:hAnsi="Arial" w:cs="Arial"/>
-          <w:b/>
-          <w:bCs/>
-        </w:rPr>
-        <w:t>o Bit</w:t>
-      </w:r>
-      <w:r>
-        <w:rPr>
-          <w:rFonts w:ascii="Arial" w:hAnsi="Arial" w:cs="Arial"/>
-          <w:b/>
-          <w:bCs/>
-        </w:rPr>
-        <w:t xml:space="preserve"> 7</w:t>
+        <w:t xml:space="preserve"> — Bit 0 ao Bit 7</w:t>
       </w:r>
       <w:r>
         <w:rPr>
@@ -2571,7 +2621,6 @@
   <w:style w:type="character" w:default="1" w:styleId="Fontepargpadro">
     <w:name w:val="Default Paragraph Font"/>
     <w:uiPriority w:val="1"/>
-    <w:semiHidden/>
     <w:unhideWhenUsed/>
   </w:style>
   <w:style w:type="table" w:default="1" w:styleId="Tabelanormal">

</xml_diff>